<commit_message>
Update Cap3 - Project report.docx
</commit_message>
<xml_diff>
--- a/Cap3_AirPassengers/3_Documentation/Cap3 - Project report.docx
+++ b/Cap3_AirPassengers/3_Documentation/Cap3 - Project report.docx
@@ -1719,7 +1719,7 @@
           <w:lang w:val="en-US"/>
         </w:rPr>
         <w:drawing>
-          <wp:inline distT="0" distB="0" distL="0" distR="0" wp14:anchorId="08F6A990" wp14:editId="1B2E641C">
+          <wp:inline distT="0" distB="0" distL="0" distR="0" wp14:anchorId="08F6A990" wp14:editId="67BBF0E4">
             <wp:extent cx="4386176" cy="2380672"/>
             <wp:effectExtent l="0" t="0" r="0" b="0"/>
             <wp:docPr id="1263510115" name="Picture 4"/>
@@ -2168,7 +2168,14 @@
           <w:szCs w:val="24"/>
         </w:rPr>
       </w:pPr>
-      <w:r>
+    </w:p>
+    <w:p>
+      <w:pPr>
+        <w:pStyle w:val="Subtitle"/>
+        <w:numPr>
+          <w:ilvl w:val="1"/>
+          <w:numId w:val="7"/>
+        </w:numPr>
         <w:rPr>
           <w:rStyle w:val="IntenseReference"/>
           <w:rFonts w:ascii="Aptos" w:hAnsi="Aptos"/>
@@ -2178,16 +2185,8 @@
           <w:sz w:val="24"/>
           <w:szCs w:val="24"/>
         </w:rPr>
-        <w:br w:type="page"/>
-      </w:r>
-    </w:p>
-    <w:p>
-      <w:pPr>
-        <w:pStyle w:val="Subtitle"/>
-        <w:numPr>
-          <w:ilvl w:val="1"/>
-          <w:numId w:val="7"/>
-        </w:numPr>
+      </w:pPr>
+      <w:r>
         <w:rPr>
           <w:rStyle w:val="IntenseReference"/>
           <w:rFonts w:ascii="Aptos" w:hAnsi="Aptos"/>
@@ -2197,7 +2196,9 @@
           <w:sz w:val="24"/>
           <w:szCs w:val="24"/>
         </w:rPr>
-      </w:pPr>
+        <w:t xml:space="preserve">LSTM (Long </w:t>
+      </w:r>
+      <w:proofErr w:type="gramStart"/>
       <w:r>
         <w:rPr>
           <w:rStyle w:val="IntenseReference"/>
@@ -2208,10 +2209,9 @@
           <w:sz w:val="24"/>
           <w:szCs w:val="24"/>
         </w:rPr>
-        <w:lastRenderedPageBreak/>
-        <w:t xml:space="preserve">LSTM (Long </w:t>
-      </w:r>
-      <w:proofErr w:type="gramStart"/>
+        <w:t>Short Term</w:t>
+      </w:r>
+      <w:proofErr w:type="gramEnd"/>
       <w:r>
         <w:rPr>
           <w:rStyle w:val="IntenseReference"/>
@@ -2222,19 +2222,6 @@
           <w:sz w:val="24"/>
           <w:szCs w:val="24"/>
         </w:rPr>
-        <w:t>Short Term</w:t>
-      </w:r>
-      <w:proofErr w:type="gramEnd"/>
-      <w:r>
-        <w:rPr>
-          <w:rStyle w:val="IntenseReference"/>
-          <w:rFonts w:ascii="Aptos" w:hAnsi="Aptos"/>
-          <w:b w:val="0"/>
-          <w:bCs w:val="0"/>
-          <w:color w:val="auto"/>
-          <w:sz w:val="24"/>
-          <w:szCs w:val="24"/>
-        </w:rPr>
         <w:t xml:space="preserve"> Memory)</w:t>
       </w:r>
     </w:p>
@@ -2318,6 +2305,7 @@
         <w:rPr>
           <w:lang w:val="en-US"/>
         </w:rPr>
+        <w:lastRenderedPageBreak/>
         <w:t xml:space="preserve">Since it’s a regressor model, </w:t>
       </w:r>
       <w:proofErr w:type="gramStart"/>
@@ -2659,8 +2647,8 @@
                                 <w:rFonts w:ascii="Segoe UI Variable Small" w:hAnsi="Segoe UI Variable Small"/>
                                 <w:color w:val="FF0000"/>
                                 <w:kern w:val="24"/>
-                                <w:sz w:val="32"/>
-                                <w:szCs w:val="32"/>
+                                <w:sz w:val="28"/>
+                                <w:szCs w:val="28"/>
                                 <w:lang w:val="en-US"/>
                                 <w14:ligatures w14:val="none"/>
                               </w:rPr>
@@ -2670,8 +2658,8 @@
                                 <w:rFonts w:ascii="Segoe UI Variable Small" w:hAnsi="Segoe UI Variable Small"/>
                                 <w:color w:val="FF0000"/>
                                 <w:kern w:val="24"/>
-                                <w:sz w:val="32"/>
-                                <w:szCs w:val="32"/>
+                                <w:sz w:val="28"/>
+                                <w:szCs w:val="28"/>
                                 <w:lang w:val="en-US"/>
                               </w:rPr>
                               <w:t>RMSE = 25.04</w:t>
@@ -2709,8 +2697,8 @@
                           <w:rFonts w:ascii="Segoe UI Variable Small" w:hAnsi="Segoe UI Variable Small"/>
                           <w:color w:val="FF0000"/>
                           <w:kern w:val="24"/>
-                          <w:sz w:val="32"/>
-                          <w:szCs w:val="32"/>
+                          <w:sz w:val="28"/>
+                          <w:szCs w:val="28"/>
                           <w:lang w:val="en-US"/>
                           <w14:ligatures w14:val="none"/>
                         </w:rPr>
@@ -2720,8 +2708,8 @@
                           <w:rFonts w:ascii="Segoe UI Variable Small" w:hAnsi="Segoe UI Variable Small"/>
                           <w:color w:val="FF0000"/>
                           <w:kern w:val="24"/>
-                          <w:sz w:val="32"/>
-                          <w:szCs w:val="32"/>
+                          <w:sz w:val="28"/>
+                          <w:szCs w:val="28"/>
                           <w:lang w:val="en-US"/>
                         </w:rPr>
                         <w:t>RMSE = 25.04</w:t>
@@ -3043,11 +3031,26 @@
       </w:r>
     </w:p>
     <w:p>
-      <w:r>
+      <w:pPr>
+        <w:rPr>
+          <w:rStyle w:val="Heading1Char"/>
+        </w:rPr>
+      </w:pPr>
+    </w:p>
+    <w:p>
+      <w:r>
+        <w:rPr>
+          <w:rStyle w:val="Heading1Char"/>
+        </w:rPr>
         <w:t>Conclusion:</w:t>
       </w:r>
       <w:r>
-        <w:t xml:space="preserve"> LSTM with its </w:t>
+        <w:t xml:space="preserve"> </w:t>
+      </w:r>
+    </w:p>
+    <w:p>
+      <w:r>
+        <w:t xml:space="preserve">LSTM with its </w:t>
       </w:r>
       <w:proofErr w:type="gramStart"/>
       <w:r>
@@ -3055,7 +3058,13 @@
       </w:r>
       <w:proofErr w:type="gramEnd"/>
       <w:r>
-        <w:t xml:space="preserve"> dependencies are a perfect for the data with least RMSE score</w:t>
+        <w:t xml:space="preserve"> dependencies </w:t>
+      </w:r>
+      <w:r>
+        <w:t xml:space="preserve">was the best model </w:t>
+      </w:r>
+      <w:r>
+        <w:t>for the data with least RMSE score</w:t>
       </w:r>
     </w:p>
     <w:p/>
@@ -3124,7 +3133,7 @@
   <w:abstractNum w:abstractNumId="0" w15:restartNumberingAfterBreak="0">
     <w:nsid w:val="FFFFFF89"/>
     <w:multiLevelType w:val="singleLevel"/>
-    <w:tmpl w:val="1D2699F2"/>
+    <w:tmpl w:val="F4C6FC24"/>
     <w:lvl w:ilvl="0">
       <w:start w:val="1"/>
       <w:numFmt w:val="bullet"/>

</xml_diff>